<commit_message>
update table of contents for .docx
</commit_message>
<xml_diff>
--- a/SSU dokumenti/SSU Elektronski Dnevnik 01 - Registracija korisnika.docx
+++ b/SSU dokumenti/SSU Elektronski Dnevnik 01 - Registracija korisnika.docx
@@ -530,7 +530,7 @@
           <w:r>
             <w:fldChar w:fldCharType="separate"/>
           </w:r>
-          <w:hyperlink w:anchor="_Toc227194519" w:history="1">
+          <w:hyperlink w:anchor="_Toc227257042" w:history="1">
             <w:r>
               <w:rPr>
                 <w:rStyle w:val="Hyperlink"/>
@@ -572,7 +572,7 @@
                 <w:noProof/>
                 <w:webHidden/>
               </w:rPr>
-              <w:instrText xml:space="preserve"> PAGEREF _Toc227194519 \h </w:instrText>
+              <w:instrText xml:space="preserve"> PAGEREF _Toc227257042 \h </w:instrText>
             </w:r>
             <w:r>
               <w:rPr>
@@ -616,7 +616,7 @@
               <w:lang w:val="en-US"/>
             </w:rPr>
           </w:pPr>
-          <w:hyperlink w:anchor="_Toc227194520" w:history="1">
+          <w:hyperlink w:anchor="_Toc227257043" w:history="1">
             <w:r>
               <w:rPr>
                 <w:rStyle w:val="Hyperlink"/>
@@ -658,7 +658,7 @@
                 <w:noProof/>
                 <w:webHidden/>
               </w:rPr>
-              <w:instrText xml:space="preserve"> PAGEREF _Toc227194520 \h </w:instrText>
+              <w:instrText xml:space="preserve"> PAGEREF _Toc227257043 \h </w:instrText>
             </w:r>
             <w:r>
               <w:rPr>
@@ -702,7 +702,7 @@
               <w:lang w:val="en-US"/>
             </w:rPr>
           </w:pPr>
-          <w:hyperlink w:anchor="_Toc227194521" w:history="1">
+          <w:hyperlink w:anchor="_Toc227257044" w:history="1">
             <w:r>
               <w:rPr>
                 <w:rStyle w:val="Hyperlink"/>
@@ -744,7 +744,7 @@
                 <w:noProof/>
                 <w:webHidden/>
               </w:rPr>
-              <w:instrText xml:space="preserve"> PAGEREF _Toc227194521 \h </w:instrText>
+              <w:instrText xml:space="preserve"> PAGEREF _Toc227257044 \h </w:instrText>
             </w:r>
             <w:r>
               <w:rPr>
@@ -788,7 +788,7 @@
               <w:lang w:val="en-US"/>
             </w:rPr>
           </w:pPr>
-          <w:hyperlink w:anchor="_Toc227194522" w:history="1">
+          <w:hyperlink w:anchor="_Toc227257045" w:history="1">
             <w:r>
               <w:rPr>
                 <w:rStyle w:val="Hyperlink"/>
@@ -830,7 +830,7 @@
                 <w:noProof/>
                 <w:webHidden/>
               </w:rPr>
-              <w:instrText xml:space="preserve"> PAGEREF _Toc227194522 \h </w:instrText>
+              <w:instrText xml:space="preserve"> PAGEREF _Toc227257045 \h </w:instrText>
             </w:r>
             <w:r>
               <w:rPr>
@@ -874,7 +874,7 @@
               <w:lang w:val="en-US"/>
             </w:rPr>
           </w:pPr>
-          <w:hyperlink w:anchor="_Toc227194523" w:history="1">
+          <w:hyperlink w:anchor="_Toc227257046" w:history="1">
             <w:r>
               <w:rPr>
                 <w:rStyle w:val="Hyperlink"/>
@@ -916,7 +916,7 @@
                 <w:noProof/>
                 <w:webHidden/>
               </w:rPr>
-              <w:instrText xml:space="preserve"> PAGEREF _Toc227194523 \h </w:instrText>
+              <w:instrText xml:space="preserve"> PAGEREF _Toc227257046 \h </w:instrText>
             </w:r>
             <w:r>
               <w:rPr>
@@ -960,7 +960,7 @@
               <w:lang w:val="en-US"/>
             </w:rPr>
           </w:pPr>
-          <w:hyperlink w:anchor="_Toc227194524" w:history="1">
+          <w:hyperlink w:anchor="_Toc227257047" w:history="1">
             <w:r>
               <w:rPr>
                 <w:rStyle w:val="Hyperlink"/>
@@ -1002,7 +1002,7 @@
                 <w:noProof/>
                 <w:webHidden/>
               </w:rPr>
-              <w:instrText xml:space="preserve"> PAGEREF _Toc227194524 \h </w:instrText>
+              <w:instrText xml:space="preserve"> PAGEREF _Toc227257047 \h </w:instrText>
             </w:r>
             <w:r>
               <w:rPr>
@@ -1046,7 +1046,7 @@
               <w:lang w:val="en-US"/>
             </w:rPr>
           </w:pPr>
-          <w:hyperlink w:anchor="_Toc227194525" w:history="1">
+          <w:hyperlink w:anchor="_Toc227257048" w:history="1">
             <w:r>
               <w:rPr>
                 <w:rStyle w:val="Hyperlink"/>
@@ -1088,7 +1088,7 @@
                 <w:noProof/>
                 <w:webHidden/>
               </w:rPr>
-              <w:instrText xml:space="preserve"> PAGEREF _Toc227194525 \h </w:instrText>
+              <w:instrText xml:space="preserve"> PAGEREF _Toc227257048 \h </w:instrText>
             </w:r>
             <w:r>
               <w:rPr>
@@ -1132,7 +1132,7 @@
               <w:lang w:val="en-US"/>
             </w:rPr>
           </w:pPr>
-          <w:hyperlink w:anchor="_Toc227194526" w:history="1">
+          <w:hyperlink w:anchor="_Toc227257049" w:history="1">
             <w:r>
               <w:rPr>
                 <w:rStyle w:val="Hyperlink"/>
@@ -1174,7 +1174,7 @@
                 <w:noProof/>
                 <w:webHidden/>
               </w:rPr>
-              <w:instrText xml:space="preserve"> PAGEREF _Toc227194526 \h </w:instrText>
+              <w:instrText xml:space="preserve"> PAGEREF _Toc227257049 \h </w:instrText>
             </w:r>
             <w:r>
               <w:rPr>
@@ -1218,7 +1218,7 @@
               <w:lang w:val="en-US"/>
             </w:rPr>
           </w:pPr>
-          <w:hyperlink w:anchor="_Toc227194527" w:history="1">
+          <w:hyperlink w:anchor="_Toc227257050" w:history="1">
             <w:r>
               <w:rPr>
                 <w:rStyle w:val="Hyperlink"/>
@@ -1260,7 +1260,7 @@
                 <w:noProof/>
                 <w:webHidden/>
               </w:rPr>
-              <w:instrText xml:space="preserve"> PAGEREF _Toc227194527 \h </w:instrText>
+              <w:instrText xml:space="preserve"> PAGEREF _Toc227257050 \h </w:instrText>
             </w:r>
             <w:r>
               <w:rPr>
@@ -1304,7 +1304,7 @@
               <w:lang w:val="en-US"/>
             </w:rPr>
           </w:pPr>
-          <w:hyperlink w:anchor="_Toc227194528" w:history="1">
+          <w:hyperlink w:anchor="_Toc227257051" w:history="1">
             <w:r>
               <w:rPr>
                 <w:rStyle w:val="Hyperlink"/>
@@ -1346,7 +1346,7 @@
                 <w:noProof/>
                 <w:webHidden/>
               </w:rPr>
-              <w:instrText xml:space="preserve"> PAGEREF _Toc227194528 \h </w:instrText>
+              <w:instrText xml:space="preserve"> PAGEREF _Toc227257051 \h </w:instrText>
             </w:r>
             <w:r>
               <w:rPr>
@@ -1390,7 +1390,7 @@
               <w:lang w:val="en-US"/>
             </w:rPr>
           </w:pPr>
-          <w:hyperlink w:anchor="_Toc227194529" w:history="1">
+          <w:hyperlink w:anchor="_Toc227257052" w:history="1">
             <w:r>
               <w:rPr>
                 <w:rStyle w:val="Hyperlink"/>
@@ -1432,7 +1432,7 @@
                 <w:noProof/>
                 <w:webHidden/>
               </w:rPr>
-              <w:instrText xml:space="preserve"> PAGEREF _Toc227194529 \h </w:instrText>
+              <w:instrText xml:space="preserve"> PAGEREF _Toc227257052 \h </w:instrText>
             </w:r>
             <w:r>
               <w:rPr>
@@ -1476,7 +1476,7 @@
               <w:lang w:val="en-US"/>
             </w:rPr>
           </w:pPr>
-          <w:hyperlink w:anchor="_Toc227194530" w:history="1">
+          <w:hyperlink w:anchor="_Toc227257053" w:history="1">
             <w:r>
               <w:rPr>
                 <w:rStyle w:val="Hyperlink"/>
@@ -1518,7 +1518,7 @@
                 <w:noProof/>
                 <w:webHidden/>
               </w:rPr>
-              <w:instrText xml:space="preserve"> PAGEREF _Toc227194530 \h </w:instrText>
+              <w:instrText xml:space="preserve"> PAGEREF _Toc227257053 \h </w:instrText>
             </w:r>
             <w:r>
               <w:rPr>
@@ -1581,7 +1581,7 @@
       <w:pPr>
         <w:pStyle w:val="Heading1"/>
       </w:pPr>
-      <w:bookmarkStart w:id="0" w:name="_Toc227194519"/>
+      <w:bookmarkStart w:id="0" w:name="_Toc227257042"/>
       <w:r>
         <w:lastRenderedPageBreak/>
         <w:t>Uvod</w:t>
@@ -1592,7 +1592,7 @@
       <w:pPr>
         <w:pStyle w:val="Heading2"/>
       </w:pPr>
-      <w:bookmarkStart w:id="1" w:name="_Toc227194520"/>
+      <w:bookmarkStart w:id="1" w:name="_Toc227257043"/>
       <w:r>
         <w:t>Rezime</w:t>
       </w:r>
@@ -1613,7 +1613,7 @@
       <w:pPr>
         <w:pStyle w:val="Heading2"/>
       </w:pPr>
-      <w:bookmarkStart w:id="2" w:name="_Toc227194521"/>
+      <w:bookmarkStart w:id="2" w:name="_Toc227257044"/>
       <w:r>
         <w:t>Namena dokumenta i ciljne grupe</w:t>
       </w:r>
@@ -1628,7 +1628,7 @@
       <w:pPr>
         <w:pStyle w:val="Heading2"/>
       </w:pPr>
-      <w:bookmarkStart w:id="3" w:name="_Toc227194522"/>
+      <w:bookmarkStart w:id="3" w:name="_Toc227257045"/>
       <w:r>
         <w:t>Reference</w:t>
       </w:r>
@@ -1662,7 +1662,7 @@
       <w:pPr>
         <w:pStyle w:val="Heading2"/>
       </w:pPr>
-      <w:bookmarkStart w:id="4" w:name="_Toc227194523"/>
+      <w:bookmarkStart w:id="4" w:name="_Toc227257046"/>
       <w:r>
         <w:t>Otvorena pitanja</w:t>
       </w:r>
@@ -1838,7 +1838,7 @@
       <w:pPr>
         <w:pStyle w:val="Heading1"/>
       </w:pPr>
-      <w:bookmarkStart w:id="5" w:name="_Toc227194524"/>
+      <w:bookmarkStart w:id="5" w:name="_Toc227257047"/>
       <w:r>
         <w:t xml:space="preserve">Scenario </w:t>
       </w:r>
@@ -1851,7 +1851,7 @@
       <w:pPr>
         <w:pStyle w:val="Heading2"/>
       </w:pPr>
-      <w:bookmarkStart w:id="6" w:name="_Toc227194525"/>
+      <w:bookmarkStart w:id="6" w:name="_Toc227257048"/>
       <w:r>
         <w:t>Kratak opis</w:t>
       </w:r>
@@ -1866,7 +1866,7 @@
       <w:pPr>
         <w:pStyle w:val="Heading2"/>
       </w:pPr>
-      <w:bookmarkStart w:id="7" w:name="_Toc227194526"/>
+      <w:bookmarkStart w:id="7" w:name="_Toc227257049"/>
       <w:r>
         <w:t>Tok događaja</w:t>
       </w:r>
@@ -1876,7 +1876,7 @@
       <w:pPr>
         <w:pStyle w:val="Heading3"/>
       </w:pPr>
-      <w:bookmarkStart w:id="8" w:name="_Toc227194527"/>
+      <w:bookmarkStart w:id="8" w:name="_Toc227257050"/>
       <w:r>
         <w:t>R</w:t>
       </w:r>
@@ -1964,15 +1964,7 @@
         <w:t xml:space="preserve">a primer, korisničko ime ili lozinka imaju neispravne karaktere </w:t>
       </w:r>
       <w:r>
-        <w:t xml:space="preserve">(poput </w:t>
-      </w:r>
-      <w:proofErr w:type="spellStart"/>
-      <w:r>
-        <w:t>space</w:t>
-      </w:r>
-      <w:proofErr w:type="spellEnd"/>
-      <w:r>
-        <w:t>))</w:t>
+        <w:t>(poput space))</w:t>
       </w:r>
     </w:p>
     <w:p>
@@ -2050,7 +2042,7 @@
       <w:pPr>
         <w:pStyle w:val="Heading2"/>
       </w:pPr>
-      <w:bookmarkStart w:id="9" w:name="_Toc227194528"/>
+      <w:bookmarkStart w:id="9" w:name="_Toc227257051"/>
       <w:r>
         <w:t>Posebni zahtevi</w:t>
       </w:r>
@@ -2068,7 +2060,7 @@
       <w:r>
         <w:t xml:space="preserve"> </w:t>
       </w:r>
-      <w:bookmarkStart w:id="10" w:name="_Toc227194529"/>
+      <w:bookmarkStart w:id="10" w:name="_Toc227257052"/>
       <w:r>
         <w:t>Preduslovi</w:t>
       </w:r>
@@ -2083,7 +2075,7 @@
       <w:pPr>
         <w:pStyle w:val="Heading2"/>
       </w:pPr>
-      <w:bookmarkStart w:id="11" w:name="_Toc227194530"/>
+      <w:bookmarkStart w:id="11" w:name="_Toc227257053"/>
       <w:r>
         <w:t>Posledice</w:t>
       </w:r>

</xml_diff>